<commit_message>
[WIP] Fix `guided-example.md`: Update Docs
</commit_message>
<xml_diff>
--- a/product-docs/.gitbook/assets/octopus-habitat-security-standard-en.docx
+++ b/product-docs/.gitbook/assets/octopus-habitat-security-standard-en.docx
@@ -63,7 +63,43 @@
           <w:color w:val="5D4495"/>
           <w:sz w:val="18"/>
         </w:rPr>
-        <w:t>Mermaid Authority  |  Certification criteria  |  Version 1.0</w:t>
+        <w:t xml:space="preserve">Mermaid </w:t>
+      </w:r>
+      <w:proofErr w:type="gramStart"/>
+      <w:r>
+        <w:rPr>
+          <w:b/>
+          <w:color w:val="5D4495"/>
+          <w:sz w:val="18"/>
+        </w:rPr>
+        <w:t>Authority  |</w:t>
+      </w:r>
+      <w:proofErr w:type="gramEnd"/>
+      <w:r>
+        <w:rPr>
+          <w:b/>
+          <w:color w:val="5D4495"/>
+          <w:sz w:val="18"/>
+        </w:rPr>
+        <w:t xml:space="preserve">  Certification </w:t>
+      </w:r>
+      <w:proofErr w:type="gramStart"/>
+      <w:r>
+        <w:rPr>
+          <w:b/>
+          <w:color w:val="5D4495"/>
+          <w:sz w:val="18"/>
+        </w:rPr>
+        <w:t>criteria  |</w:t>
+      </w:r>
+      <w:proofErr w:type="gramEnd"/>
+      <w:r>
+        <w:rPr>
+          <w:b/>
+          <w:color w:val="5D4495"/>
+          <w:sz w:val="18"/>
+        </w:rPr>
+        <w:t xml:space="preserve">  Version 1.0</w:t>
       </w:r>
     </w:p>
     <w:p>
@@ -114,8 +150,8 @@
         <w:tblLook w:val="04A0" w:firstRow="1" w:lastRow="0" w:firstColumn="1" w:lastColumn="0" w:noHBand="0" w:noVBand="1"/>
       </w:tblPr>
       <w:tblGrid>
-        <w:gridCol w:w="936"/>
-        <w:gridCol w:w="7344"/>
+        <w:gridCol w:w="1296"/>
+        <w:gridCol w:w="6984"/>
         <w:gridCol w:w="1800"/>
       </w:tblGrid>
       <w:tr>
@@ -124,7 +160,7 @@
         </w:trPr>
         <w:tc>
           <w:tcPr>
-            <w:tcW w:w="936" w:type="dxa"/>
+            <w:tcW w:w="1296" w:type="dxa"/>
             <w:shd w:val="clear" w:color="auto" w:fill="F1EDF8"/>
             <w:vAlign w:val="center"/>
           </w:tcPr>
@@ -143,7 +179,7 @@
         </w:tc>
         <w:tc>
           <w:tcPr>
-            <w:tcW w:w="7344" w:type="dxa"/>
+            <w:tcW w:w="6984" w:type="dxa"/>
             <w:shd w:val="clear" w:color="auto" w:fill="F1EDF8"/>
             <w:vAlign w:val="center"/>
           </w:tcPr>
@@ -186,7 +222,7 @@
         </w:trPr>
         <w:tc>
           <w:tcPr>
-            <w:tcW w:w="936" w:type="dxa"/>
+            <w:tcW w:w="1296" w:type="dxa"/>
             <w:vAlign w:val="center"/>
           </w:tcPr>
           <w:p>
@@ -205,7 +241,7 @@
         </w:tc>
         <w:tc>
           <w:tcPr>
-            <w:tcW w:w="7344" w:type="dxa"/>
+            <w:tcW w:w="6984" w:type="dxa"/>
             <w:vAlign w:val="center"/>
           </w:tcPr>
           <w:p>
@@ -244,7 +280,7 @@
         </w:trPr>
         <w:tc>
           <w:tcPr>
-            <w:tcW w:w="936" w:type="dxa"/>
+            <w:tcW w:w="1296" w:type="dxa"/>
             <w:vAlign w:val="center"/>
           </w:tcPr>
           <w:p>
@@ -263,7 +299,7 @@
         </w:tc>
         <w:tc>
           <w:tcPr>
-            <w:tcW w:w="7344" w:type="dxa"/>
+            <w:tcW w:w="6984" w:type="dxa"/>
             <w:vAlign w:val="center"/>
           </w:tcPr>
           <w:p>
@@ -302,7 +338,7 @@
         </w:trPr>
         <w:tc>
           <w:tcPr>
-            <w:tcW w:w="936" w:type="dxa"/>
+            <w:tcW w:w="1296" w:type="dxa"/>
             <w:vAlign w:val="center"/>
           </w:tcPr>
           <w:p>
@@ -321,7 +357,7 @@
         </w:tc>
         <w:tc>
           <w:tcPr>
-            <w:tcW w:w="7344" w:type="dxa"/>
+            <w:tcW w:w="6984" w:type="dxa"/>
             <w:vAlign w:val="center"/>
           </w:tcPr>
           <w:p>
@@ -384,8 +420,8 @@
         <w:tblLook w:val="04A0" w:firstRow="1" w:lastRow="0" w:firstColumn="1" w:lastColumn="0" w:noHBand="0" w:noVBand="1"/>
       </w:tblPr>
       <w:tblGrid>
-        <w:gridCol w:w="936"/>
-        <w:gridCol w:w="7344"/>
+        <w:gridCol w:w="1296"/>
+        <w:gridCol w:w="6984"/>
         <w:gridCol w:w="1800"/>
       </w:tblGrid>
       <w:tr>
@@ -394,7 +430,7 @@
         </w:trPr>
         <w:tc>
           <w:tcPr>
-            <w:tcW w:w="936" w:type="dxa"/>
+            <w:tcW w:w="1296" w:type="dxa"/>
             <w:shd w:val="clear" w:color="auto" w:fill="F1EDF8"/>
             <w:vAlign w:val="center"/>
           </w:tcPr>
@@ -413,7 +449,7 @@
         </w:tc>
         <w:tc>
           <w:tcPr>
-            <w:tcW w:w="7344" w:type="dxa"/>
+            <w:tcW w:w="6984" w:type="dxa"/>
             <w:shd w:val="clear" w:color="auto" w:fill="F1EDF8"/>
             <w:vAlign w:val="center"/>
           </w:tcPr>
@@ -456,7 +492,7 @@
         </w:trPr>
         <w:tc>
           <w:tcPr>
-            <w:tcW w:w="936" w:type="dxa"/>
+            <w:tcW w:w="1296" w:type="dxa"/>
             <w:vAlign w:val="center"/>
           </w:tcPr>
           <w:p>
@@ -475,7 +511,7 @@
         </w:tc>
         <w:tc>
           <w:tcPr>
-            <w:tcW w:w="7344" w:type="dxa"/>
+            <w:tcW w:w="6984" w:type="dxa"/>
             <w:vAlign w:val="center"/>
           </w:tcPr>
           <w:p>
@@ -484,9 +520,10 @@
             </w:pPr>
             <w:r>
               <w:rPr>
+                <w:b/>
                 <w:sz w:val="18"/>
               </w:rPr>
-              <w:t>Inspect structural supports, anchoring points and entry hatches at least quarterly. Record and repair defects that could destabilize the habitat or permit unauthorized entry.</w:t>
+              <w:t>Inspect and maintain habitat structures and access points.</w:t>
             </w:r>
           </w:p>
         </w:tc>
@@ -510,12 +547,136 @@
       </w:tr>
       <w:tr>
         <w:trPr>
+          <w:jc w:val="center"/>
+        </w:trPr>
+        <w:tc>
+          <w:tcPr>
+            <w:tcW w:w="1296" w:type="dxa"/>
+            <w:shd w:val="clear" w:color="auto" w:fill="F2F2F2" w:themeFill="background1" w:themeFillShade="F2"/>
+            <w:vAlign w:val="center"/>
+          </w:tcPr>
+          <w:p>
+            <w:pPr>
+              <w:spacing w:after="0"/>
+              <w:ind w:left="80"/>
+            </w:pPr>
+            <w:r>
+              <w:rPr>
+                <w:b/>
+                <w:color w:val="5D4495"/>
+                <w:sz w:val="18"/>
+              </w:rPr>
+              <w:t>OH 2.1.1</w:t>
+            </w:r>
+          </w:p>
+        </w:tc>
+        <w:tc>
+          <w:tcPr>
+            <w:tcW w:w="6984" w:type="dxa"/>
+            <w:shd w:val="clear" w:color="auto" w:fill="F2F2F2" w:themeFill="background1" w:themeFillShade="F2"/>
+            <w:vAlign w:val="center"/>
+          </w:tcPr>
+          <w:p>
+            <w:pPr>
+              <w:spacing w:after="0"/>
+            </w:pPr>
+            <w:r>
+              <w:rPr>
+                <w:sz w:val="18"/>
+              </w:rPr>
+              <w:t>Inspect structural supports, anchoring points and entry hatches at least quarterly.</w:t>
+            </w:r>
+          </w:p>
+        </w:tc>
+        <w:tc>
+          <w:tcPr>
+            <w:tcW w:w="1800" w:type="dxa"/>
+            <w:shd w:val="clear" w:color="auto" w:fill="F2F2F2" w:themeFill="background1" w:themeFillShade="F2"/>
+            <w:vAlign w:val="center"/>
+          </w:tcPr>
+          <w:p>
+            <w:pPr>
+              <w:spacing w:after="0"/>
+            </w:pPr>
+            <w:r>
+              <w:rPr>
+                <w:sz w:val="18"/>
+              </w:rPr>
+              <w:t>Habitat</w:t>
+            </w:r>
+          </w:p>
+        </w:tc>
+      </w:tr>
+      <w:tr>
+        <w:trPr>
+          <w:jc w:val="center"/>
+        </w:trPr>
+        <w:tc>
+          <w:tcPr>
+            <w:tcW w:w="1296" w:type="dxa"/>
+            <w:shd w:val="clear" w:color="auto" w:fill="F2F2F2" w:themeFill="background1" w:themeFillShade="F2"/>
+            <w:vAlign w:val="center"/>
+          </w:tcPr>
+          <w:p>
+            <w:pPr>
+              <w:spacing w:after="0"/>
+              <w:ind w:left="80"/>
+            </w:pPr>
+            <w:r>
+              <w:rPr>
+                <w:b/>
+                <w:color w:val="5D4495"/>
+                <w:sz w:val="18"/>
+              </w:rPr>
+              <w:t>OH 2.1.2</w:t>
+            </w:r>
+          </w:p>
+        </w:tc>
+        <w:tc>
+          <w:tcPr>
+            <w:tcW w:w="6984" w:type="dxa"/>
+            <w:shd w:val="clear" w:color="auto" w:fill="F2F2F2" w:themeFill="background1" w:themeFillShade="F2"/>
+            <w:vAlign w:val="center"/>
+          </w:tcPr>
+          <w:p>
+            <w:pPr>
+              <w:spacing w:after="0"/>
+            </w:pPr>
+            <w:r>
+              <w:rPr>
+                <w:sz w:val="18"/>
+              </w:rPr>
+              <w:t>Record and repair defects that could destabilize the habitat or permit unauthorized entry.</w:t>
+            </w:r>
+          </w:p>
+        </w:tc>
+        <w:tc>
+          <w:tcPr>
+            <w:tcW w:w="1800" w:type="dxa"/>
+            <w:shd w:val="clear" w:color="auto" w:fill="F2F2F2" w:themeFill="background1" w:themeFillShade="F2"/>
+            <w:vAlign w:val="center"/>
+          </w:tcPr>
+          <w:p>
+            <w:pPr>
+              <w:spacing w:after="0"/>
+            </w:pPr>
+            <w:r>
+              <w:rPr>
+                <w:sz w:val="18"/>
+              </w:rPr>
+              <w:t>Habitat</w:t>
+            </w:r>
+          </w:p>
+        </w:tc>
+      </w:tr>
+      <w:tr>
+        <w:trPr>
           <w:cantSplit/>
           <w:jc w:val="center"/>
         </w:trPr>
         <w:tc>
           <w:tcPr>
-            <w:tcW w:w="936" w:type="dxa"/>
+            <w:tcW w:w="1296" w:type="dxa"/>
             <w:vAlign w:val="center"/>
           </w:tcPr>
           <w:p>
@@ -534,7 +695,7 @@
         </w:tc>
         <w:tc>
           <w:tcPr>
-            <w:tcW w:w="7344" w:type="dxa"/>
+            <w:tcW w:w="6984" w:type="dxa"/>
             <w:vAlign w:val="center"/>
           </w:tcPr>
           <w:p>
@@ -545,7 +706,21 @@
               <w:rPr>
                 <w:sz w:val="18"/>
               </w:rPr>
-              <w:t>Equip the habitat with alerts for strong currents and unauthorized entry, and test both alerts at least monthly.</w:t>
+              <w:t xml:space="preserve">Equip the habitat with alerts for strong currents and unauthorized </w:t>
+            </w:r>
+            <w:proofErr w:type="gramStart"/>
+            <w:r>
+              <w:rPr>
+                <w:sz w:val="18"/>
+              </w:rPr>
+              <w:t>entry, and</w:t>
+            </w:r>
+            <w:proofErr w:type="gramEnd"/>
+            <w:r>
+              <w:rPr>
+                <w:sz w:val="18"/>
+              </w:rPr>
+              <w:t xml:space="preserve"> test both alerts at least monthly.</w:t>
             </w:r>
           </w:p>
           <w:p>
@@ -625,7 +800,7 @@
         </w:trPr>
         <w:tc>
           <w:tcPr>
-            <w:tcW w:w="936" w:type="dxa"/>
+            <w:tcW w:w="1296" w:type="dxa"/>
             <w:vAlign w:val="center"/>
           </w:tcPr>
           <w:p>
@@ -644,7 +819,7 @@
         </w:tc>
         <w:tc>
           <w:tcPr>
-            <w:tcW w:w="7344" w:type="dxa"/>
+            <w:tcW w:w="6984" w:type="dxa"/>
             <w:vAlign w:val="center"/>
           </w:tcPr>
           <w:p>
@@ -753,8 +928,8 @@
         <w:tblLook w:val="04A0" w:firstRow="1" w:lastRow="0" w:firstColumn="1" w:lastColumn="0" w:noHBand="0" w:noVBand="1"/>
       </w:tblPr>
       <w:tblGrid>
-        <w:gridCol w:w="936"/>
-        <w:gridCol w:w="7344"/>
+        <w:gridCol w:w="1296"/>
+        <w:gridCol w:w="6984"/>
         <w:gridCol w:w="1800"/>
       </w:tblGrid>
       <w:tr>
@@ -763,7 +938,7 @@
         </w:trPr>
         <w:tc>
           <w:tcPr>
-            <w:tcW w:w="936" w:type="dxa"/>
+            <w:tcW w:w="1296" w:type="dxa"/>
             <w:shd w:val="clear" w:color="auto" w:fill="F1EDF8"/>
             <w:vAlign w:val="center"/>
           </w:tcPr>
@@ -782,7 +957,7 @@
         </w:tc>
         <w:tc>
           <w:tcPr>
-            <w:tcW w:w="7344" w:type="dxa"/>
+            <w:tcW w:w="6984" w:type="dxa"/>
             <w:shd w:val="clear" w:color="auto" w:fill="F1EDF8"/>
             <w:vAlign w:val="center"/>
           </w:tcPr>
@@ -825,7 +1000,7 @@
         </w:trPr>
         <w:tc>
           <w:tcPr>
-            <w:tcW w:w="936" w:type="dxa"/>
+            <w:tcW w:w="1296" w:type="dxa"/>
             <w:vAlign w:val="center"/>
           </w:tcPr>
           <w:p>
@@ -844,7 +1019,7 @@
         </w:tc>
         <w:tc>
           <w:tcPr>
-            <w:tcW w:w="7344" w:type="dxa"/>
+            <w:tcW w:w="6984" w:type="dxa"/>
             <w:vAlign w:val="center"/>
           </w:tcPr>
           <w:p>
@@ -884,7 +1059,7 @@
         </w:trPr>
         <w:tc>
           <w:tcPr>
-            <w:tcW w:w="936" w:type="dxa"/>
+            <w:tcW w:w="1296" w:type="dxa"/>
             <w:vAlign w:val="center"/>
           </w:tcPr>
           <w:p>
@@ -903,7 +1078,7 @@
         </w:tc>
         <w:tc>
           <w:tcPr>
-            <w:tcW w:w="7344" w:type="dxa"/>
+            <w:tcW w:w="6984" w:type="dxa"/>
             <w:vAlign w:val="center"/>
           </w:tcPr>
           <w:p>
@@ -975,7 +1150,7 @@
         </w:trPr>
         <w:tc>
           <w:tcPr>
-            <w:tcW w:w="936" w:type="dxa"/>
+            <w:tcW w:w="1296" w:type="dxa"/>
             <w:vAlign w:val="center"/>
           </w:tcPr>
           <w:p>
@@ -994,7 +1169,7 @@
         </w:tc>
         <w:tc>
           <w:tcPr>
-            <w:tcW w:w="7344" w:type="dxa"/>
+            <w:tcW w:w="6984" w:type="dxa"/>
             <w:vAlign w:val="center"/>
           </w:tcPr>
           <w:p>
@@ -1381,7 +1556,39 @@
         <w:color w:val="646469"/>
         <w:sz w:val="16"/>
       </w:rPr>
-      <w:t>Mermaid Authority  |  Octopus Habitat Security Standard  |  1.0</w:t>
+      <w:t xml:space="preserve">Mermaid </w:t>
+    </w:r>
+    <w:proofErr w:type="gramStart"/>
+    <w:r>
+      <w:rPr>
+        <w:color w:val="646469"/>
+        <w:sz w:val="16"/>
+      </w:rPr>
+      <w:t>Authority  |</w:t>
+    </w:r>
+    <w:proofErr w:type="gramEnd"/>
+    <w:r>
+      <w:rPr>
+        <w:color w:val="646469"/>
+        <w:sz w:val="16"/>
+      </w:rPr>
+      <w:t xml:space="preserve">  Octopus Habitat Security </w:t>
+    </w:r>
+    <w:proofErr w:type="gramStart"/>
+    <w:r>
+      <w:rPr>
+        <w:color w:val="646469"/>
+        <w:sz w:val="16"/>
+      </w:rPr>
+      <w:t>Standard  |</w:t>
+    </w:r>
+    <w:proofErr w:type="gramEnd"/>
+    <w:r>
+      <w:rPr>
+        <w:color w:val="646469"/>
+        <w:sz w:val="16"/>
+      </w:rPr>
+      <w:t xml:space="preserve">  1.0</w:t>
     </w:r>
   </w:p>
 </w:ftr>

</xml_diff>